<commit_message>
chore: rebrand to MSCQR and print QR-only labels
</commit_message>
<xml_diff>
--- a/DOCUMENTS/README.docx
+++ b/DOCUMENTS/README.docx
@@ -8,7 +8,7 @@
         <w:spacing w:before="240" w:after="120"/>
       </w:pPr>
       <w:r>
-        <w:t xml:space="preserve">Genuine Scan (AuthenticQR)</w:t>
+        <w:t xml:space="preserve">Genuine Scan (MSCQR)</w:t>
       </w:r>
     </w:p>
     <w:p>
@@ -48,7 +48,7 @@
         <w:spacing w:after="80"/>
       </w:pPr>
       <w:r>
-        <w:t xml:space="preserve">AuthenticQR is designed for anti-counterfeit operations across four user types:</w:t>
+        <w:t xml:space="preserve">MSCQR is designed for anti-counterfeit operations across four user types:</w:t>
       </w:r>
     </w:p>
     <w:p>
@@ -5387,7 +5387,7 @@
         <w:spacing w:after="60"/>
       </w:pPr>
       <w:r>
-        <w:t xml:space="preserve">admin@authenticqr.com / admin123 (super admin)</w:t>
+        <w:t xml:space="preserve">admin@mscqr.com / admin123 (super admin)</w:t>
       </w:r>
     </w:p>
     <w:p>
@@ -7471,7 +7471,7 @@
         <w:spacing w:after="80"/>
       </w:pPr>
       <w:r>
-        <w:t xml:space="preserve">AuthenticQR now includes a fully local, no-cost in-app assistant:</w:t>
+        <w:t xml:space="preserve">MSCQR now includes a fully local, no-cost in-app assistant:</w:t>
       </w:r>
     </w:p>
     <w:p>

</xml_diff>